<commit_message>
Update resume files and add temporary files
Updated both PDF and DOCX versions of Ashish Kumar's resume. Added temporary and lock files
</commit_message>
<xml_diff>
--- a/Ashish kumar Resume.docx
+++ b/Ashish kumar Resume.docx
@@ -37,58 +37,60 @@
     <w:p>
       <w:pPr>
         <w:pStyle w:val="Heading1"/>
+        <w:spacing w:before="0"/>
+        <w:jc w:val="center"/>
         <w:rPr>
-          <w:sz w:val="22"/>
-          <w:szCs w:val="30"/>
-          <w:lang w:val="en-IN"/>
+          <w:rStyle w:val="Hyperlink"/>
+          <w:color w:val="444444"/>
+          <w:u w:val="none"/>
         </w:rPr>
       </w:pPr>
       <w:r>
         <w:rPr>
-          <w:sz w:val="22"/>
-          <w:szCs w:val="30"/>
+          <w:sz w:val="20"/>
+          <w:szCs w:val="28"/>
         </w:rPr>
         <w:t>Chandigarh, India</w:t>
       </w:r>
       <w:r>
         <w:rPr>
-          <w:sz w:val="22"/>
-          <w:szCs w:val="30"/>
+          <w:sz w:val="20"/>
+          <w:szCs w:val="28"/>
         </w:rPr>
         <w:t xml:space="preserve"> |</w:t>
       </w:r>
       <w:r>
         <w:rPr>
-          <w:sz w:val="22"/>
-          <w:szCs w:val="30"/>
+          <w:sz w:val="20"/>
+          <w:szCs w:val="28"/>
         </w:rPr>
         <w:t xml:space="preserve"> </w:t>
       </w:r>
       <w:r>
         <w:rPr>
-          <w:sz w:val="22"/>
-          <w:szCs w:val="30"/>
+          <w:sz w:val="20"/>
+          <w:szCs w:val="28"/>
         </w:rPr>
         <w:t>+91</w:t>
       </w:r>
       <w:r>
         <w:rPr>
-          <w:sz w:val="22"/>
-          <w:szCs w:val="30"/>
+          <w:sz w:val="20"/>
+          <w:szCs w:val="28"/>
         </w:rPr>
         <w:t xml:space="preserve"> </w:t>
       </w:r>
       <w:r>
         <w:rPr>
-          <w:sz w:val="22"/>
-          <w:szCs w:val="30"/>
+          <w:sz w:val="20"/>
+          <w:szCs w:val="28"/>
         </w:rPr>
         <w:t>9417143628</w:t>
       </w:r>
       <w:r>
         <w:rPr>
-          <w:sz w:val="22"/>
-          <w:szCs w:val="30"/>
+          <w:sz w:val="20"/>
+          <w:szCs w:val="28"/>
         </w:rPr>
         <w:t xml:space="preserve"> | </w:t>
       </w:r>
@@ -96,58 +98,75 @@
         <w:r>
           <w:rPr>
             <w:rStyle w:val="Hyperlink"/>
-            <w:color w:val="0070C0"/>
-            <w:sz w:val="22"/>
-            <w:szCs w:val="30"/>
+            <w:color w:val="444444"/>
+            <w:sz w:val="20"/>
+            <w:szCs w:val="28"/>
+            <w:u w:val="none"/>
           </w:rPr>
           <w:t>ashishk.codes@gmail.com</w:t>
         </w:r>
       </w:hyperlink>
       <w:r>
         <w:rPr>
-          <w:color w:val="0070C0"/>
-          <w:sz w:val="22"/>
-          <w:szCs w:val="30"/>
+          <w:rStyle w:val="Hyperlink"/>
+          <w:color w:val="444444"/>
+          <w:u w:val="none"/>
         </w:rPr>
-        <w:t xml:space="preserve"> </w:t>
+        <w:t xml:space="preserve"> |</w:t>
       </w:r>
-      <w:r>
+    </w:p>
+    <w:p>
+      <w:pPr>
+        <w:pStyle w:val="Heading1"/>
+        <w:spacing w:before="0"/>
+        <w:jc w:val="center"/>
         <w:rPr>
-          <w:sz w:val="22"/>
-          <w:szCs w:val="30"/>
+          <w:rStyle w:val="Hyperlink"/>
+          <w:color w:val="444444"/>
+          <w:sz w:val="20"/>
+          <w:szCs w:val="28"/>
+          <w:u w:val="none"/>
         </w:rPr>
-        <w:t xml:space="preserve">| </w:t>
-      </w:r>
+      </w:pPr>
       <w:hyperlink r:id="rId12" w:history="1">
         <w:r>
           <w:rPr>
             <w:rStyle w:val="Hyperlink"/>
-            <w:color w:val="0070C0"/>
-            <w:sz w:val="22"/>
-            <w:szCs w:val="30"/>
+            <w:color w:val="444444"/>
+            <w:sz w:val="20"/>
+            <w:szCs w:val="28"/>
+            <w:u w:val="none"/>
           </w:rPr>
           <w:t>github.com/akrathor18</w:t>
         </w:r>
       </w:hyperlink>
       <w:r>
         <w:rPr>
-          <w:color w:val="0070C0"/>
-          <w:sz w:val="22"/>
-          <w:szCs w:val="30"/>
+          <w:rStyle w:val="Hyperlink"/>
+          <w:color w:val="444444"/>
+          <w:sz w:val="20"/>
+          <w:szCs w:val="28"/>
+          <w:u w:val="none"/>
         </w:rPr>
         <w:t xml:space="preserve"> </w:t>
       </w:r>
       <w:r>
         <w:rPr>
-          <w:sz w:val="22"/>
-          <w:szCs w:val="30"/>
+          <w:rStyle w:val="Hyperlink"/>
+          <w:color w:val="444444"/>
+          <w:sz w:val="20"/>
+          <w:szCs w:val="28"/>
+          <w:u w:val="none"/>
         </w:rPr>
-        <w:t>|</w:t>
+        <w:t>•</w:t>
       </w:r>
       <w:r>
         <w:rPr>
-          <w:sz w:val="22"/>
-          <w:szCs w:val="30"/>
+          <w:rStyle w:val="Hyperlink"/>
+          <w:color w:val="444444"/>
+          <w:sz w:val="20"/>
+          <w:szCs w:val="28"/>
+          <w:u w:val="none"/>
         </w:rPr>
         <w:t xml:space="preserve"> </w:t>
       </w:r>
@@ -155,24 +174,67 @@
         <w:r>
           <w:rPr>
             <w:rStyle w:val="Hyperlink"/>
-            <w:bCs/>
-            <w:color w:val="0070C0"/>
-            <w:sz w:val="22"/>
-            <w:szCs w:val="30"/>
-            <w:lang w:val="en-IN"/>
+            <w:color w:val="444444"/>
+            <w:sz w:val="20"/>
+            <w:szCs w:val="28"/>
+            <w:u w:val="none"/>
           </w:rPr>
           <w:t>LinkedIn</w:t>
         </w:r>
         <w:r>
           <w:rPr>
             <w:rStyle w:val="Hyperlink"/>
-            <w:bCs/>
+            <w:color w:val="444444"/>
+            <w:sz w:val="20"/>
+            <w:szCs w:val="28"/>
+            <w:u w:val="none"/>
+          </w:rPr>
+          <w:t>.com/</w:t>
+        </w:r>
+        <w:r>
+          <w:rPr>
+            <w:rStyle w:val="Hyperlink"/>
+            <w:color w:val="444444"/>
+            <w:sz w:val="20"/>
+            <w:szCs w:val="28"/>
+            <w:u w:val="none"/>
+          </w:rPr>
+          <w:t>in/ashishkumartech</w:t>
+        </w:r>
+        <w:r>
+          <w:rPr>
+            <w:rStyle w:val="Hyperlink"/>
             <w:color w:val="0070C0"/>
-            <w:sz w:val="22"/>
-            <w:szCs w:val="30"/>
-            <w:lang w:val="en-IN"/>
+            <w:sz w:val="20"/>
+            <w:szCs w:val="28"/>
+            <w:u w:val="none"/>
           </w:rPr>
           <w:t> </w:t>
+        </w:r>
+      </w:hyperlink>
+      <w:r>
+        <w:t>•</w:t>
+      </w:r>
+      <w:r>
+        <w:rPr>
+          <w:rStyle w:val="Hyperlink"/>
+          <w:color w:val="0070C0"/>
+          <w:sz w:val="20"/>
+          <w:szCs w:val="28"/>
+          <w:u w:val="none"/>
+        </w:rPr>
+        <w:t xml:space="preserve"> </w:t>
+      </w:r>
+      <w:hyperlink r:id="rId14" w:history="1">
+        <w:r>
+          <w:rPr>
+            <w:rStyle w:val="Hyperlink"/>
+            <w:color w:val="444444"/>
+            <w:sz w:val="20"/>
+            <w:szCs w:val="28"/>
+            <w:u w:val="none"/>
+          </w:rPr>
+          <w:t>ashish-codes.web.app</w:t>
         </w:r>
       </w:hyperlink>
     </w:p>
@@ -974,57 +1036,65 @@
         <w:t>Note-Sharing Web App</w:t>
       </w:r>
       <w:r>
-        <w:t xml:space="preserve"> |</w:t>
+        <w:t xml:space="preserve"> </w:t>
+      </w:r>
+      <w:r>
+        <w:t>•</w:t>
       </w:r>
       <w:r>
         <w:t xml:space="preserve"> </w:t>
       </w:r>
       <w:r>
-        <w:rPr>
-          <w:u w:val="single"/>
-        </w:rPr>
         <w:t>GitHub</w:t>
       </w:r>
       <w:r>
-        <w:rPr>
-          <w:u w:val="single"/>
-        </w:rPr>
         <w:t>:</w:t>
       </w:r>
       <w:r>
         <w:t xml:space="preserve"> </w:t>
       </w:r>
-      <w:hyperlink r:id="rId14" w:history="1">
+      <w:hyperlink r:id="rId15" w:history="1">
         <w:r>
           <w:rPr>
             <w:rStyle w:val="Hyperlink"/>
-            <w:color w:val="0070C0"/>
+            <w:color w:val="444444"/>
+            <w:u w:val="none"/>
           </w:rPr>
           <w:t>github.com/akrathor18/Note-sharing-app</w:t>
         </w:r>
       </w:hyperlink>
       <w:r>
-        <w:t xml:space="preserve"> |</w:t>
+        <w:rPr>
+          <w:color w:val="444444"/>
+        </w:rPr>
+        <w:t xml:space="preserve"> </w:t>
+      </w:r>
+      <w:r>
+        <w:t>•</w:t>
       </w:r>
       <w:r>
         <w:t xml:space="preserve"> </w:t>
       </w:r>
       <w:r>
-        <w:rPr>
-          <w:u w:val="single"/>
-        </w:rPr>
         <w:t>Live</w:t>
       </w:r>
       <w:r>
-        <w:t xml:space="preserve">: </w:t>
+        <w:t>:</w:t>
       </w:r>
-      <w:hyperlink r:id="rId15" w:history="1">
+      <w:r>
+        <w:rPr>
+          <w:color w:val="444444"/>
+        </w:rPr>
+        <w:t xml:space="preserve"> </w:t>
+      </w:r>
+      <w:hyperlink r:id="rId16" w:history="1">
         <w:r>
           <w:rPr>
             <w:rStyle w:val="Hyperlink"/>
-            <w:color w:val="0070C0"/>
+            <w:color w:val="444444"/>
+            <w:u w:val="none"/>
           </w:rPr>
-          <w:t>https://studyhub-dev.web.app/</w:t>
+          <w:t>studyhub-dev.web.app/</w:t>
         </w:r>
       </w:hyperlink>
     </w:p>
@@ -1472,15 +1542,12 @@
         <w:t xml:space="preserve"> </w:t>
       </w:r>
       <w:r>
-        <w:t>|</w:t>
+        <w:t>•</w:t>
       </w:r>
       <w:r>
         <w:t xml:space="preserve"> </w:t>
       </w:r>
       <w:r>
-        <w:rPr>
-          <w:u w:val="single"/>
-        </w:rPr>
         <w:t>Demo</w:t>
       </w:r>
       <w:r>
@@ -1488,15 +1555,16 @@
       </w:r>
       <w:r>
         <w:rPr>
-          <w:color w:val="0070C0"/>
+          <w:color w:val="444444"/>
         </w:rPr>
         <w:t xml:space="preserve"> </w:t>
       </w:r>
-      <w:hyperlink r:id="rId16" w:history="1">
+      <w:hyperlink r:id="rId17" w:history="1">
         <w:r>
           <w:rPr>
             <w:rStyle w:val="Hyperlink"/>
-            <w:color w:val="0070C0"/>
+            <w:color w:val="444444"/>
+            <w:u w:val="none"/>
           </w:rPr>
           <w:t>invent-labs-frontend.vercel.app</w:t>
         </w:r>
@@ -2471,7 +2539,6 @@
     <w:lvl w:ilvl="0">
       <w:start w:val="1"/>
       <w:numFmt w:val="bullet"/>
-      <w:pStyle w:val="ListBullet"/>
       <w:lvlText w:val=""/>
       <w:lvlJc w:val="left"/>
       <w:pPr>
@@ -2724,8 +2791,8 @@
   <w:abstractNum w:abstractNumId="12" w15:restartNumberingAfterBreak="0">
     <w:nsid w:val="5A7D401F"/>
     <w:multiLevelType w:val="hybridMultilevel"/>
-    <w:tmpl w:val="3110B7FE"/>
-    <w:lvl w:ilvl="0" w:tplc="40090001">
+    <w:tmpl w:val="713EEF42"/>
+    <w:lvl w:ilvl="0" w:tplc="4AD06950">
       <w:start w:val="1"/>
       <w:numFmt w:val="bullet"/>
       <w:lvlText w:val=""/>
@@ -2735,6 +2802,7 @@
       </w:pPr>
       <w:rPr>
         <w:rFonts w:ascii="Symbol" w:hAnsi="Symbol" w:hint="default"/>
+        <w:color w:val="444444"/>
       </w:rPr>
     </w:lvl>
     <w:lvl w:ilvl="1" w:tplc="40090003" w:tentative="1">
@@ -3603,6 +3671,7 @@
   <w:style w:type="character" w:default="1" w:styleId="DefaultParagraphFont">
     <w:name w:val="Default Paragraph Font"/>
     <w:uiPriority w:val="1"/>
+    <w:semiHidden/>
     <w:unhideWhenUsed/>
   </w:style>
   <w:style w:type="table" w:default="1" w:styleId="TableNormal">
@@ -28566,9 +28635,11 @@
     <w:rsid w:val="00860EA7"/>
     <w:rsid w:val="008D4D06"/>
     <w:rsid w:val="00900579"/>
+    <w:rsid w:val="009609F8"/>
     <w:rsid w:val="00A772F4"/>
     <w:rsid w:val="00B01FFA"/>
     <w:rsid w:val="00B53406"/>
+    <w:rsid w:val="00B556D6"/>
     <w:rsid w:val="00D07D56"/>
     <w:rsid w:val="00EE7D6B"/>
     <w:rsid w:val="00F535AE"/>
@@ -29600,12 +29671,7 @@
 </file>
 
 <file path=customXml/item2.xml><?xml version="1.0" encoding="utf-8"?>
-<?mso-contentType ?>
-<FormTemplates xmlns="http://schemas.microsoft.com/sharepoint/v3/contenttype/forms">
-  <Display>DocumentLibraryForm</Display>
-  <Edit>DocumentLibraryForm</Edit>
-  <New>DocumentLibraryForm</New>
-</FormTemplates>
+<b:Sources xmlns:b="http://schemas.openxmlformats.org/officeDocument/2006/bibliography" xmlns="http://schemas.openxmlformats.org/officeDocument/2006/bibliography" SelectedStyle="\APASixthEditionOfficeOnline.xsl" StyleName="APA" Version="6"/>
 </file>
 
 <file path=customXml/item3.xml><?xml version="1.0" encoding="utf-8"?>
@@ -29629,7 +29695,12 @@
 </file>
 
 <file path=customXml/item4.xml><?xml version="1.0" encoding="utf-8"?>
-<b:Sources xmlns:b="http://schemas.openxmlformats.org/officeDocument/2006/bibliography" xmlns="http://schemas.openxmlformats.org/officeDocument/2006/bibliography" SelectedStyle="\APASixthEditionOfficeOnline.xsl" StyleName="APA" Version="6"/>
+<?mso-contentType ?>
+<FormTemplates xmlns="http://schemas.microsoft.com/sharepoint/v3/contenttype/forms">
+  <Display>DocumentLibraryForm</Display>
+  <Edit>DocumentLibraryForm</Edit>
+  <New>DocumentLibraryForm</New>
+</FormTemplates>
 </file>
 
 <file path=customXml/itemProps1.xml><?xml version="1.0" encoding="utf-8"?>
@@ -29654,9 +29725,9 @@
 </file>
 
 <file path=customXml/itemProps2.xml><?xml version="1.0" encoding="utf-8"?>
-<ds:datastoreItem xmlns:ds="http://schemas.openxmlformats.org/officeDocument/2006/customXml" ds:itemID="{AABE5AEB-BD32-46FB-B4E8-5C314C3FA503}">
+<ds:datastoreItem xmlns:ds="http://schemas.openxmlformats.org/officeDocument/2006/customXml" ds:itemID="{B690CEF4-07C7-4C0C-A6BB-7328017E8EDA}">
   <ds:schemaRefs>
-    <ds:schemaRef ds:uri="http://schemas.microsoft.com/sharepoint/v3/contenttype/forms"/>
+    <ds:schemaRef ds:uri="http://schemas.openxmlformats.org/officeDocument/2006/bibliography"/>
   </ds:schemaRefs>
 </ds:datastoreItem>
 </file>
@@ -29674,9 +29745,9 @@
 </file>
 
 <file path=customXml/itemProps4.xml><?xml version="1.0" encoding="utf-8"?>
-<ds:datastoreItem xmlns:ds="http://schemas.openxmlformats.org/officeDocument/2006/customXml" ds:itemID="{B690CEF4-07C7-4C0C-A6BB-7328017E8EDA}">
+<ds:datastoreItem xmlns:ds="http://schemas.openxmlformats.org/officeDocument/2006/customXml" ds:itemID="{AABE5AEB-BD32-46FB-B4E8-5C314C3FA503}">
   <ds:schemaRefs>
-    <ds:schemaRef ds:uri="http://schemas.openxmlformats.org/officeDocument/2006/bibliography"/>
+    <ds:schemaRef ds:uri="http://schemas.microsoft.com/sharepoint/v3/contenttype/forms"/>
   </ds:schemaRefs>
 </ds:datastoreItem>
 </file>

</xml_diff>